<commit_message>
escalation changes were limited
</commit_message>
<xml_diff>
--- a/temp_test/output.docx
+++ b/temp_test/output.docx
@@ -70,7 +70,7 @@
           </w:tcPr>
           <w:p>
             <w:r>
-              <w:t>Detail</w:t>
+              <w:t xml:space="preserve"> </w:t>
             </w:r>
           </w:p>
         </w:tc>
@@ -126,7 +126,7 @@
           </w:tcPr>
           <w:p>
             <w:r>
-              <w:t>Submission time and date:</w:t>
+              <w:t xml:space="preserve"> </w:t>
             </w:r>
           </w:p>
         </w:tc>
@@ -141,18 +141,13 @@
               </w:rPr>
               <w:t xml:space="preserve"> </w:t>
             </w:r>
-            <w:r>
-              <w:t xml:space="preserve"> </w:t>
-            </w:r>
+            <w:r/>
             <w:r>
               <w:rPr>
                 <w:vertAlign w:val="superscript"/>
               </w:rPr>
-              <w:t xml:space="preserve"> </w:t>
             </w:r>
-            <w:r>
-              <w:t xml:space="preserve"> </w:t>
-            </w:r>
+            <w:r/>
           </w:p>
         </w:tc>
       </w:tr>
@@ -163,7 +158,7 @@
           </w:tcPr>
           <w:p>
             <w:r>
-              <w:t>Target feedback time and date:</w:t>
+              <w:t xml:space="preserve"> </w:t>
             </w:r>
           </w:p>
         </w:tc>
@@ -178,18 +173,13 @@
               </w:rPr>
               <w:t xml:space="preserve"> </w:t>
             </w:r>
-            <w:r>
-              <w:t xml:space="preserve"> </w:t>
-            </w:r>
+            <w:r/>
             <w:r>
               <w:rPr>
                 <w:vertAlign w:val="superscript"/>
               </w:rPr>
-              <w:t xml:space="preserve"> </w:t>
             </w:r>
-            <w:r>
-              <w:t xml:space="preserve"> </w:t>
-            </w:r>
+            <w:r/>
           </w:p>
         </w:tc>
       </w:tr>
@@ -254,7 +244,7 @@
           </w:tcPr>
           <w:p>
             <w:r>
-              <w:t>John Smith</w:t>
+              <w:t xml:space="preserve"> </w:t>
             </w:r>
           </w:p>
         </w:tc>
@@ -354,7 +344,7 @@
           </w:tcPr>
           <w:p>
             <w:r>
-              <w:t>Formative Submission</w:t>
+              <w:t xml:space="preserve"> </w:t>
             </w:r>
           </w:p>
         </w:tc>
@@ -476,7 +466,7 @@
     </w:p>
     <w:p>
       <w:r>
-        <w:t>Tutor Name: Prof. Green</w:t>
+        <w:t xml:space="preserve">Tutor Name:  </w:t>
       </w:r>
     </w:p>
     <w:p>
@@ -659,7 +649,9 @@
             <w:tcW w:type="dxa" w:w="4320"/>
           </w:tcPr>
           <w:p>
-            <w:r/>
+            <w:r>
+              <w:t xml:space="preserve"> </w:t>
+            </w:r>
           </w:p>
         </w:tc>
         <w:tc>
@@ -668,7 +660,7 @@
           </w:tcPr>
           <w:p>
             <w:r>
-              <w:t>Option B: Turnitin Submission</w:t>
+              <w:t xml:space="preserve"> </w:t>
             </w:r>
           </w:p>
         </w:tc>
@@ -782,7 +774,11 @@
           <w:tcPr>
             <w:tcW w:type="dxa" w:w="4320"/>
           </w:tcPr>
-          <w:p/>
+          <w:p>
+            <w:r>
+              <w:t xml:space="preserve"> </w:t>
+            </w:r>
+          </w:p>
         </w:tc>
         <w:tc>
           <w:tcPr>

</xml_diff>

<commit_message>
bug fixes and module improvization
</commit_message>
<xml_diff>
--- a/temp_test/output.docx
+++ b/temp_test/output.docx
@@ -344,7 +344,7 @@
           </w:tcPr>
           <w:p>
             <w:r>
-              <w:t xml:space="preserve"> </w:t>
+              <w:t>Formative Submission</w:t>
             </w:r>
           </w:p>
         </w:tc>
@@ -649,9 +649,7 @@
             <w:tcW w:type="dxa" w:w="4320"/>
           </w:tcPr>
           <w:p>
-            <w:r>
-              <w:t xml:space="preserve"> </w:t>
-            </w:r>
+            <w:r/>
           </w:p>
         </w:tc>
         <w:tc>
@@ -774,11 +772,7 @@
           <w:tcPr>
             <w:tcW w:type="dxa" w:w="4320"/>
           </w:tcPr>
-          <w:p>
-            <w:r>
-              <w:t xml:space="preserve"> </w:t>
-            </w:r>
-          </w:p>
+          <w:p/>
         </w:tc>
         <w:tc>
           <w:tcPr>

</xml_diff>